<commit_message>
Add and update Artifacts word + pdf files
</commit_message>
<xml_diff>
--- a/SG3_Devices/SG3_Artifacts/SG3_SupplReqs.docx
+++ b/SG3_Devices/SG3_Artifacts/SG3_SupplReqs.docx
@@ -4,7 +4,7 @@
   <w:body>
     <w:p>
       <w:pPr>
-        <w:pStyle w:val="Rubrik1"/>
+        <w:pStyle w:val="Heading1"/>
       </w:pPr>
       <w:r>
         <w:t xml:space="preserve">Supplementary Requirements Documentation </w:t>
@@ -13,7 +13,7 @@
     <w:p/>
     <w:p>
       <w:pPr>
-        <w:pStyle w:val="Rubrik1"/>
+        <w:pStyle w:val="Heading1"/>
       </w:pPr>
       <w:r>
         <w:t>Interactive House Project</w:t>
@@ -26,7 +26,7 @@
     <w:p/>
     <w:p>
       <w:pPr>
-        <w:pStyle w:val="Rubrik"/>
+        <w:pStyle w:val="Title"/>
       </w:pPr>
       <w:r>
         <w:t>Revision History</w:t>
@@ -362,8 +362,18 @@
                 <w:sz w:val="20"/>
                 <w:szCs w:val="20"/>
               </w:rPr>
-              <w:t>Sergej Macut</w:t>
-            </w:r>
+              <w:t xml:space="preserve">Sergej </w:t>
+            </w:r>
+            <w:proofErr w:type="spellStart"/>
+            <w:r>
+              <w:rPr>
+                <w:color w:val="000000"/>
+                <w:sz w:val="20"/>
+                <w:szCs w:val="20"/>
+              </w:rPr>
+              <w:t>Macut</w:t>
+            </w:r>
+            <w:proofErr w:type="spellEnd"/>
           </w:p>
         </w:tc>
       </w:tr>
@@ -504,8 +514,17 @@
                 <w:sz w:val="20"/>
                 <w:szCs w:val="20"/>
               </w:rPr>
-              <w:t>Sergej Macut</w:t>
-            </w:r>
+              <w:t xml:space="preserve">Sergej </w:t>
+            </w:r>
+            <w:proofErr w:type="spellStart"/>
+            <w:r>
+              <w:rPr>
+                <w:sz w:val="20"/>
+                <w:szCs w:val="20"/>
+              </w:rPr>
+              <w:t>Macut</w:t>
+            </w:r>
+            <w:proofErr w:type="spellEnd"/>
           </w:p>
         </w:tc>
       </w:tr>
@@ -655,15 +674,161 @@
           </w:p>
         </w:tc>
       </w:tr>
+      <w:tr>
+        <w:tc>
+          <w:tcPr>
+            <w:tcW w:w="2304" w:type="dxa"/>
+            <w:tcMar>
+              <w:top w:w="0" w:type="dxa"/>
+              <w:bottom w:w="0" w:type="dxa"/>
+            </w:tcMar>
+          </w:tcPr>
+          <w:p>
+            <w:pPr>
+              <w:keepLines/>
+              <w:widowControl w:val="0"/>
+              <w:pBdr>
+                <w:top w:val="nil"/>
+                <w:left w:val="nil"/>
+                <w:bottom w:val="nil"/>
+                <w:right w:val="nil"/>
+                <w:between w:val="nil"/>
+              </w:pBdr>
+              <w:spacing w:after="120"/>
+              <w:rPr>
+                <w:color w:val="000000"/>
+                <w:sz w:val="20"/>
+                <w:szCs w:val="20"/>
+              </w:rPr>
+            </w:pPr>
+            <w:r>
+              <w:rPr>
+                <w:color w:val="000000"/>
+                <w:sz w:val="20"/>
+                <w:szCs w:val="20"/>
+              </w:rPr>
+              <w:t>2026-04-23</w:t>
+            </w:r>
+          </w:p>
+        </w:tc>
+        <w:tc>
+          <w:tcPr>
+            <w:tcW w:w="1152" w:type="dxa"/>
+            <w:tcMar>
+              <w:top w:w="0" w:type="dxa"/>
+              <w:bottom w:w="0" w:type="dxa"/>
+            </w:tcMar>
+          </w:tcPr>
+          <w:p>
+            <w:pPr>
+              <w:keepLines/>
+              <w:widowControl w:val="0"/>
+              <w:pBdr>
+                <w:top w:val="nil"/>
+                <w:left w:val="nil"/>
+                <w:bottom w:val="nil"/>
+                <w:right w:val="nil"/>
+                <w:between w:val="nil"/>
+              </w:pBdr>
+              <w:spacing w:after="120"/>
+              <w:rPr>
+                <w:color w:val="000000"/>
+                <w:sz w:val="20"/>
+                <w:szCs w:val="20"/>
+              </w:rPr>
+            </w:pPr>
+            <w:r>
+              <w:rPr>
+                <w:color w:val="000000"/>
+                <w:sz w:val="20"/>
+                <w:szCs w:val="20"/>
+              </w:rPr>
+              <w:t>1.3</w:t>
+            </w:r>
+          </w:p>
+        </w:tc>
+        <w:tc>
+          <w:tcPr>
+            <w:tcW w:w="3744" w:type="dxa"/>
+            <w:tcMar>
+              <w:top w:w="0" w:type="dxa"/>
+              <w:bottom w:w="0" w:type="dxa"/>
+            </w:tcMar>
+          </w:tcPr>
+          <w:p>
+            <w:pPr>
+              <w:keepLines/>
+              <w:widowControl w:val="0"/>
+              <w:pBdr>
+                <w:top w:val="nil"/>
+                <w:left w:val="nil"/>
+                <w:bottom w:val="nil"/>
+                <w:right w:val="nil"/>
+                <w:between w:val="nil"/>
+              </w:pBdr>
+              <w:spacing w:after="120"/>
+              <w:rPr>
+                <w:color w:val="000000"/>
+                <w:sz w:val="20"/>
+                <w:szCs w:val="20"/>
+              </w:rPr>
+            </w:pPr>
+            <w:r>
+              <w:rPr>
+                <w:color w:val="000000"/>
+                <w:sz w:val="20"/>
+                <w:szCs w:val="20"/>
+              </w:rPr>
+              <w:t>Autonomous Safety &amp; Environmental Responsiveness</w:t>
+            </w:r>
+          </w:p>
+        </w:tc>
+        <w:tc>
+          <w:tcPr>
+            <w:tcW w:w="2304" w:type="dxa"/>
+            <w:tcMar>
+              <w:top w:w="0" w:type="dxa"/>
+              <w:bottom w:w="0" w:type="dxa"/>
+            </w:tcMar>
+          </w:tcPr>
+          <w:p>
+            <w:pPr>
+              <w:keepLines/>
+              <w:widowControl w:val="0"/>
+              <w:pBdr>
+                <w:top w:val="nil"/>
+                <w:left w:val="nil"/>
+                <w:bottom w:val="nil"/>
+                <w:right w:val="nil"/>
+                <w:between w:val="nil"/>
+              </w:pBdr>
+              <w:spacing w:after="120"/>
+              <w:rPr>
+                <w:color w:val="000000"/>
+                <w:sz w:val="20"/>
+                <w:szCs w:val="20"/>
+              </w:rPr>
+            </w:pPr>
+            <w:r>
+              <w:rPr>
+                <w:color w:val="000000"/>
+                <w:sz w:val="20"/>
+                <w:szCs w:val="20"/>
+              </w:rPr>
+              <w:t>Mustafa Al-Bayati</w:t>
+            </w:r>
+          </w:p>
+        </w:tc>
+      </w:tr>
     </w:tbl>
     <w:p>
       <w:pPr>
-        <w:pStyle w:val="Rubrik3"/>
-      </w:pPr>
-    </w:p>
-    <w:p>
-      <w:pPr>
-        <w:pStyle w:val="Rubrik"/>
+        <w:pStyle w:val="Heading3"/>
+      </w:pPr>
+    </w:p>
+    <w:p>
+      <w:pPr>
+        <w:pStyle w:val="Title"/>
       </w:pPr>
       <w:r>
         <w:t>Supplementary Requirements List</w:t>
@@ -868,7 +1033,15 @@
               <w:spacing w:before="120" w:after="120"/>
             </w:pPr>
             <w:r>
-              <w:t>S2.Performance - Response Latency</w:t>
+              <w:t>S</w:t>
+            </w:r>
+            <w:proofErr w:type="gramStart"/>
+            <w:r>
+              <w:t>2.Performance</w:t>
+            </w:r>
+            <w:proofErr w:type="gramEnd"/>
+            <w:r>
+              <w:t xml:space="preserve"> - Response Latency</w:t>
             </w:r>
           </w:p>
         </w:tc>
@@ -1083,10 +1256,66 @@
           </w:p>
         </w:tc>
       </w:tr>
+      <w:tr>
+        <w:trPr>
+          <w:trHeight w:val="546"/>
+        </w:trPr>
+        <w:tc>
+          <w:tcPr>
+            <w:tcW w:w="5306" w:type="dxa"/>
+            <w:tcMar>
+              <w:top w:w="0" w:type="dxa"/>
+              <w:bottom w:w="0" w:type="dxa"/>
+            </w:tcMar>
+          </w:tcPr>
+          <w:p>
+            <w:r>
+              <w:t>S6. Autonomous Safety &amp; Environmental Responsiveness</w:t>
+            </w:r>
+          </w:p>
+        </w:tc>
+        <w:tc>
+          <w:tcPr>
+            <w:tcW w:w="3906" w:type="dxa"/>
+            <w:tcMar>
+              <w:top w:w="0" w:type="dxa"/>
+              <w:bottom w:w="0" w:type="dxa"/>
+            </w:tcMar>
+          </w:tcPr>
+          <w:p>
+            <w:pPr>
+              <w:widowControl w:val="0"/>
+              <w:pBdr>
+                <w:top w:val="nil"/>
+                <w:left w:val="nil"/>
+                <w:bottom w:val="nil"/>
+                <w:right w:val="nil"/>
+                <w:between w:val="nil"/>
+              </w:pBdr>
+              <w:tabs>
+                <w:tab w:val="center" w:pos="4320"/>
+                <w:tab w:val="right" w:pos="8640"/>
+              </w:tabs>
+              <w:jc w:val="center"/>
+              <w:rPr>
+                <w:sz w:val="20"/>
+                <w:szCs w:val="20"/>
+              </w:rPr>
+            </w:pPr>
+            <w:r>
+              <w:rPr>
+                <w:sz w:val="20"/>
+                <w:szCs w:val="20"/>
+              </w:rPr>
+              <w:t>Essential</w:t>
+            </w:r>
+          </w:p>
+        </w:tc>
+      </w:tr>
     </w:tbl>
     <w:p>
       <w:pPr>
-        <w:pStyle w:val="Rubrik"/>
+        <w:pStyle w:val="Title"/>
       </w:pPr>
       <w:r>
         <w:br w:type="page"/>
@@ -1094,7 +1323,7 @@
     </w:p>
     <w:p>
       <w:pPr>
-        <w:pStyle w:val="Rubrik"/>
+        <w:pStyle w:val="Title"/>
       </w:pPr>
       <w:r>
         <w:lastRenderedPageBreak/>
@@ -1105,9 +1334,33 @@
     <w:p>
       <w:pPr>
         <w:spacing w:line="360" w:lineRule="auto"/>
-      </w:pPr>
-      <w:r>
-        <w:t>S1. Interoperability - Middleman Architecture</w:t>
+        <w:rPr>
+          <w:b/>
+          <w:bCs/>
+        </w:rPr>
+      </w:pPr>
+      <w:r>
+        <w:rPr>
+          <w:b/>
+          <w:bCs/>
+        </w:rPr>
+        <w:t>S1</w:t>
+      </w:r>
+    </w:p>
+    <w:p>
+      <w:pPr>
+        <w:spacing w:line="360" w:lineRule="auto"/>
+        <w:rPr>
+          <w:b/>
+          <w:bCs/>
+        </w:rPr>
+      </w:pPr>
+      <w:r>
+        <w:rPr>
+          <w:b/>
+          <w:bCs/>
+        </w:rPr>
+        <w:t>Interoperability - Middleman Architecture</w:t>
       </w:r>
     </w:p>
     <w:p>
@@ -1126,9 +1379,33 @@
     <w:p>
       <w:pPr>
         <w:spacing w:line="360" w:lineRule="auto"/>
-      </w:pPr>
-      <w:r>
-        <w:t>S2. Performance - Response Latency</w:t>
+        <w:rPr>
+          <w:b/>
+          <w:bCs/>
+        </w:rPr>
+      </w:pPr>
+      <w:r>
+        <w:rPr>
+          <w:b/>
+          <w:bCs/>
+        </w:rPr>
+        <w:t>S2</w:t>
+      </w:r>
+    </w:p>
+    <w:p>
+      <w:pPr>
+        <w:spacing w:line="360" w:lineRule="auto"/>
+        <w:rPr>
+          <w:b/>
+          <w:bCs/>
+        </w:rPr>
+      </w:pPr>
+      <w:r>
+        <w:rPr>
+          <w:b/>
+          <w:bCs/>
+        </w:rPr>
+        <w:t>Performance - Response Latency</w:t>
       </w:r>
     </w:p>
     <w:p>
@@ -1147,9 +1424,33 @@
     <w:p>
       <w:pPr>
         <w:spacing w:line="360" w:lineRule="auto"/>
-      </w:pPr>
-      <w:r>
-        <w:t>S3. Reliability - Simulation Stability</w:t>
+        <w:rPr>
+          <w:b/>
+          <w:bCs/>
+        </w:rPr>
+      </w:pPr>
+      <w:r>
+        <w:rPr>
+          <w:b/>
+          <w:bCs/>
+        </w:rPr>
+        <w:t>S3</w:t>
+      </w:r>
+    </w:p>
+    <w:p>
+      <w:pPr>
+        <w:spacing w:line="360" w:lineRule="auto"/>
+        <w:rPr>
+          <w:b/>
+          <w:bCs/>
+        </w:rPr>
+      </w:pPr>
+      <w:r>
+        <w:rPr>
+          <w:b/>
+          <w:bCs/>
+        </w:rPr>
+        <w:t>Reliability - Simulation Stability</w:t>
       </w:r>
     </w:p>
     <w:p>
@@ -1168,9 +1469,33 @@
     <w:p>
       <w:pPr>
         <w:spacing w:line="360" w:lineRule="auto"/>
-      </w:pPr>
-      <w:r>
-        <w:t>S4. Design Language - UML Standards</w:t>
+        <w:rPr>
+          <w:b/>
+          <w:bCs/>
+        </w:rPr>
+      </w:pPr>
+      <w:r>
+        <w:rPr>
+          <w:b/>
+          <w:bCs/>
+        </w:rPr>
+        <w:t>S4</w:t>
+      </w:r>
+    </w:p>
+    <w:p>
+      <w:pPr>
+        <w:spacing w:line="360" w:lineRule="auto"/>
+        <w:rPr>
+          <w:b/>
+          <w:bCs/>
+        </w:rPr>
+      </w:pPr>
+      <w:r>
+        <w:rPr>
+          <w:b/>
+          <w:bCs/>
+        </w:rPr>
+        <w:t>Design Language - UML Standards</w:t>
       </w:r>
     </w:p>
     <w:p>
@@ -1189,9 +1514,33 @@
     <w:p>
       <w:pPr>
         <w:spacing w:line="360" w:lineRule="auto"/>
-      </w:pPr>
-      <w:r>
-        <w:t>S5. Fault Handling – Communication Robustness</w:t>
+        <w:rPr>
+          <w:b/>
+          <w:bCs/>
+        </w:rPr>
+      </w:pPr>
+      <w:r>
+        <w:rPr>
+          <w:b/>
+          <w:bCs/>
+        </w:rPr>
+        <w:t>S5</w:t>
+      </w:r>
+    </w:p>
+    <w:p>
+      <w:pPr>
+        <w:spacing w:line="360" w:lineRule="auto"/>
+        <w:rPr>
+          <w:b/>
+          <w:bCs/>
+        </w:rPr>
+      </w:pPr>
+      <w:r>
+        <w:rPr>
+          <w:b/>
+          <w:bCs/>
+        </w:rPr>
+        <w:t>Fault Handling – Communication Robustness</w:t>
       </w:r>
     </w:p>
     <w:p>
@@ -1204,7 +1553,7 @@
     </w:p>
     <w:p>
       <w:pPr>
-        <w:pStyle w:val="Liststycke"/>
+        <w:pStyle w:val="ListParagraph"/>
         <w:spacing w:line="360" w:lineRule="auto"/>
       </w:pPr>
       <w:r>
@@ -1213,7 +1562,7 @@
     </w:p>
     <w:p>
       <w:pPr>
-        <w:pStyle w:val="Liststycke"/>
+        <w:pStyle w:val="ListParagraph"/>
         <w:spacing w:line="360" w:lineRule="auto"/>
       </w:pPr>
       <w:r>
@@ -1222,12 +1571,223 @@
     </w:p>
     <w:p>
       <w:pPr>
-        <w:pStyle w:val="Liststycke"/>
+        <w:pStyle w:val="ListParagraph"/>
         <w:spacing w:line="360" w:lineRule="auto"/>
       </w:pPr>
       <w:r>
         <w:t>Maintain the last known valid device state.</w:t>
       </w:r>
+    </w:p>
+    <w:p>
+      <w:pPr>
+        <w:pStyle w:val="ListParagraph"/>
+        <w:spacing w:line="360" w:lineRule="auto"/>
+      </w:pPr>
+    </w:p>
+    <w:p>
+      <w:pPr>
+        <w:spacing w:line="360" w:lineRule="auto"/>
+        <w:rPr>
+          <w:b/>
+          <w:bCs/>
+        </w:rPr>
+      </w:pPr>
+      <w:r>
+        <w:rPr>
+          <w:b/>
+          <w:bCs/>
+        </w:rPr>
+        <w:lastRenderedPageBreak/>
+        <w:t>S6</w:t>
+      </w:r>
+    </w:p>
+    <w:p>
+      <w:pPr>
+        <w:spacing w:line="360" w:lineRule="auto"/>
+        <w:rPr>
+          <w:b/>
+          <w:bCs/>
+        </w:rPr>
+      </w:pPr>
+      <w:r>
+        <w:rPr>
+          <w:b/>
+          <w:bCs/>
+        </w:rPr>
+        <w:t>Autonomous Safety &amp; Environmental Responsiveness</w:t>
+      </w:r>
+    </w:p>
+    <w:p>
+      <w:pPr>
+        <w:spacing w:line="360" w:lineRule="auto"/>
+        <w:rPr>
+          <w:lang w:val="en-SE"/>
+        </w:rPr>
+      </w:pPr>
+      <w:r>
+        <w:rPr>
+          <w:lang w:val="en-SE"/>
+        </w:rPr>
+        <w:t xml:space="preserve">The device must be capable of reacting to environmental conditions </w:t>
+      </w:r>
+      <w:r>
+        <w:rPr>
+          <w:b/>
+          <w:bCs/>
+          <w:lang w:val="en-SE"/>
+        </w:rPr>
+        <w:t>independently of external systems (Gateway or Server)</w:t>
+      </w:r>
+      <w:r>
+        <w:rPr>
+          <w:lang w:val="en-SE"/>
+        </w:rPr>
+        <w:t>.</w:t>
+      </w:r>
+    </w:p>
+    <w:p>
+      <w:pPr>
+        <w:spacing w:line="360" w:lineRule="auto"/>
+        <w:rPr>
+          <w:lang w:val="en-SE"/>
+        </w:rPr>
+      </w:pPr>
+      <w:r>
+        <w:rPr>
+          <w:lang w:val="en-SE"/>
+        </w:rPr>
+        <w:t>This includes:</w:t>
+      </w:r>
+    </w:p>
+    <w:p>
+      <w:pPr>
+        <w:numPr>
+          <w:ilvl w:val="0"/>
+          <w:numId w:val="2"/>
+        </w:numPr>
+        <w:spacing w:line="360" w:lineRule="auto"/>
+        <w:rPr>
+          <w:lang w:val="en-SE"/>
+        </w:rPr>
+      </w:pPr>
+      <w:r>
+        <w:rPr>
+          <w:lang w:val="en-SE"/>
+        </w:rPr>
+        <w:t xml:space="preserve">Detecting hazardous conditions (gas, fire, extreme temperature) </w:t>
+      </w:r>
+    </w:p>
+    <w:p>
+      <w:pPr>
+        <w:numPr>
+          <w:ilvl w:val="0"/>
+          <w:numId w:val="2"/>
+        </w:numPr>
+        <w:spacing w:line="360" w:lineRule="auto"/>
+        <w:rPr>
+          <w:lang w:val="en-SE"/>
+        </w:rPr>
+      </w:pPr>
+      <w:r>
+        <w:rPr>
+          <w:lang w:val="en-SE"/>
+        </w:rPr>
+        <w:t xml:space="preserve">Responding immediately with appropriate actuator actions </w:t>
+      </w:r>
+    </w:p>
+    <w:p>
+      <w:pPr>
+        <w:numPr>
+          <w:ilvl w:val="0"/>
+          <w:numId w:val="2"/>
+        </w:numPr>
+        <w:spacing w:line="360" w:lineRule="auto"/>
+        <w:rPr>
+          <w:lang w:val="en-SE"/>
+        </w:rPr>
+      </w:pPr>
+      <w:r>
+        <w:rPr>
+          <w:lang w:val="en-SE"/>
+        </w:rPr>
+        <w:t>Ensuring safety-critical responses occur even during communication failure</w:t>
+      </w:r>
+    </w:p>
+    <w:p>
+      <w:pPr>
+        <w:spacing w:line="360" w:lineRule="auto"/>
+        <w:rPr>
+          <w:lang w:val="en-SE"/>
+        </w:rPr>
+      </w:pPr>
+      <w:r>
+        <w:rPr>
+          <w:lang w:val="en-SE"/>
+        </w:rPr>
+        <w:t>Examples:</w:t>
+      </w:r>
+    </w:p>
+    <w:p>
+      <w:pPr>
+        <w:numPr>
+          <w:ilvl w:val="0"/>
+          <w:numId w:val="3"/>
+        </w:numPr>
+        <w:spacing w:line="360" w:lineRule="auto"/>
+        <w:rPr>
+          <w:lang w:val="en-SE"/>
+        </w:rPr>
+      </w:pPr>
+      <w:r>
+        <w:rPr>
+          <w:lang w:val="en-SE"/>
+        </w:rPr>
+        <w:t xml:space="preserve">Gas detected → trigger buzzer immediately </w:t>
+      </w:r>
+    </w:p>
+    <w:p>
+      <w:pPr>
+        <w:numPr>
+          <w:ilvl w:val="0"/>
+          <w:numId w:val="3"/>
+        </w:numPr>
+        <w:spacing w:line="360" w:lineRule="auto"/>
+        <w:rPr>
+          <w:lang w:val="en-SE"/>
+        </w:rPr>
+      </w:pPr>
+      <w:r>
+        <w:rPr>
+          <w:lang w:val="en-SE"/>
+        </w:rPr>
+        <w:t xml:space="preserve">Rain detected → close window without waiting for server </w:t>
+      </w:r>
+    </w:p>
+    <w:p>
+      <w:pPr>
+        <w:numPr>
+          <w:ilvl w:val="0"/>
+          <w:numId w:val="3"/>
+        </w:numPr>
+        <w:spacing w:line="360" w:lineRule="auto"/>
+        <w:rPr>
+          <w:lang w:val="en-SE"/>
+        </w:rPr>
+      </w:pPr>
+      <w:r>
+        <w:rPr>
+          <w:lang w:val="en-SE"/>
+        </w:rPr>
+        <w:t>Fire risk → open door and activate alarm</w:t>
+      </w:r>
+    </w:p>
+    <w:p>
+      <w:pPr>
+        <w:spacing w:line="360" w:lineRule="auto"/>
+        <w:rPr>
+          <w:lang w:val="en-SE"/>
+        </w:rPr>
+      </w:pPr>
     </w:p>
     <w:sectPr>
       <w:pgSz w:w="11906" w:h="16838"/>
@@ -1242,6 +1802,304 @@
 <file path=word/numbering.xml><?xml version="1.0" encoding="utf-8"?>
 <w:numbering xmlns:wpc="http://schemas.microsoft.com/office/word/2010/wordprocessingCanvas" xmlns:cx="http://schemas.microsoft.com/office/drawing/2014/chartex" xmlns:cx1="http://schemas.microsoft.com/office/drawing/2015/9/8/chartex" xmlns:cx2="http://schemas.microsoft.com/office/drawing/2015/10/21/chartex" xmlns:cx3="http://schemas.microsoft.com/office/drawing/2016/5/9/chartex" xmlns:cx4="http://schemas.microsoft.com/office/drawing/2016/5/10/chartex" xmlns:cx5="http://schemas.microsoft.com/office/drawing/2016/5/11/chartex" xmlns:cx6="http://schemas.microsoft.com/office/drawing/2016/5/12/chartex" xmlns:cx7="http://schemas.microsoft.com/office/drawing/2016/5/13/chartex" xmlns:cx8="http://schemas.microsoft.com/office/drawing/2016/5/14/chartex" xmlns:mc="http://schemas.openxmlformats.org/markup-compatibility/2006" xmlns:aink="http://schemas.microsoft.com/office/drawing/2016/ink" xmlns:am3d="http://schemas.microsoft.com/office/drawing/2017/model3d" xmlns:o="urn:schemas-microsoft-com:office:office" xmlns:oel="http://schemas.microsoft.com/office/2019/extlst" xmlns:r="http://schemas.openxmlformats.org/officeDocument/2006/relationships" xmlns:m="http://schemas.openxmlformats.org/officeDocument/2006/math" xmlns:v="urn:schemas-microsoft-com:vml" xmlns:wp14="http://schemas.microsoft.com/office/word/2010/wordprocessingDrawing" xmlns:wp="http://schemas.openxmlformats.org/drawingml/2006/wordprocessingDrawing" xmlns:w10="urn:schemas-microsoft-com:office:word" xmlns:w="http://schemas.openxmlformats.org/wordprocessingml/2006/main" xmlns:w14="http://schemas.microsoft.com/office/word/2010/wordml" xmlns:w15="http://schemas.microsoft.com/office/word/2012/wordml" xmlns:w16cex="http://schemas.microsoft.com/office/word/2018/wordml/cex" xmlns:w16cid="http://schemas.microsoft.com/office/word/2016/wordml/cid" xmlns:w16="http://schemas.microsoft.com/office/word/2018/wordml" xmlns:w16du="http://schemas.microsoft.com/office/word/2023/wordml/word16du" xmlns:w16sdtdh="http://schemas.microsoft.com/office/word/2020/wordml/sdtdatahash" xmlns:w16sdtfl="http://schemas.microsoft.com/office/word/2024/wordml/sdtformatlock" xmlns:w16se="http://schemas.microsoft.com/office/word/2015/wordml/symex" xmlns:wpg="http://schemas.microsoft.com/office/word/2010/wordprocessingGroup" xmlns:wpi="http://schemas.microsoft.com/office/word/2010/wordprocessingInk" xmlns:wne="http://schemas.microsoft.com/office/word/2006/wordml" xmlns:wps="http://schemas.microsoft.com/office/word/2010/wordprocessingShape" mc:Ignorable="w14 w15 w16se w16cid w16 w16cex w16sdtdh w16sdtfl w16du wp14">
   <w:abstractNum w:abstractNumId="0" w15:restartNumberingAfterBreak="0">
+    <w:nsid w:val="04335123"/>
+    <w:multiLevelType w:val="multilevel"/>
+    <w:tmpl w:val="05FCE166"/>
+    <w:lvl w:ilvl="0">
+      <w:start w:val="1"/>
+      <w:numFmt w:val="bullet"/>
+      <w:lvlText w:val=""/>
+      <w:lvlJc w:val="left"/>
+      <w:pPr>
+        <w:tabs>
+          <w:tab w:val="num" w:pos="720"/>
+        </w:tabs>
+        <w:ind w:left="720" w:hanging="360"/>
+      </w:pPr>
+      <w:rPr>
+        <w:rFonts w:ascii="Symbol" w:hAnsi="Symbol" w:hint="default"/>
+        <w:sz w:val="20"/>
+      </w:rPr>
+    </w:lvl>
+    <w:lvl w:ilvl="1" w:tentative="1">
+      <w:start w:val="1"/>
+      <w:numFmt w:val="bullet"/>
+      <w:lvlText w:val="o"/>
+      <w:lvlJc w:val="left"/>
+      <w:pPr>
+        <w:tabs>
+          <w:tab w:val="num" w:pos="1440"/>
+        </w:tabs>
+        <w:ind w:left="1440" w:hanging="360"/>
+      </w:pPr>
+      <w:rPr>
+        <w:rFonts w:ascii="Courier New" w:hAnsi="Courier New" w:hint="default"/>
+        <w:sz w:val="20"/>
+      </w:rPr>
+    </w:lvl>
+    <w:lvl w:ilvl="2" w:tentative="1">
+      <w:start w:val="1"/>
+      <w:numFmt w:val="bullet"/>
+      <w:lvlText w:val=""/>
+      <w:lvlJc w:val="left"/>
+      <w:pPr>
+        <w:tabs>
+          <w:tab w:val="num" w:pos="2160"/>
+        </w:tabs>
+        <w:ind w:left="2160" w:hanging="360"/>
+      </w:pPr>
+      <w:rPr>
+        <w:rFonts w:ascii="Wingdings" w:hAnsi="Wingdings" w:hint="default"/>
+        <w:sz w:val="20"/>
+      </w:rPr>
+    </w:lvl>
+    <w:lvl w:ilvl="3" w:tentative="1">
+      <w:start w:val="1"/>
+      <w:numFmt w:val="bullet"/>
+      <w:lvlText w:val=""/>
+      <w:lvlJc w:val="left"/>
+      <w:pPr>
+        <w:tabs>
+          <w:tab w:val="num" w:pos="2880"/>
+        </w:tabs>
+        <w:ind w:left="2880" w:hanging="360"/>
+      </w:pPr>
+      <w:rPr>
+        <w:rFonts w:ascii="Wingdings" w:hAnsi="Wingdings" w:hint="default"/>
+        <w:sz w:val="20"/>
+      </w:rPr>
+    </w:lvl>
+    <w:lvl w:ilvl="4" w:tentative="1">
+      <w:start w:val="1"/>
+      <w:numFmt w:val="bullet"/>
+      <w:lvlText w:val=""/>
+      <w:lvlJc w:val="left"/>
+      <w:pPr>
+        <w:tabs>
+          <w:tab w:val="num" w:pos="3600"/>
+        </w:tabs>
+        <w:ind w:left="3600" w:hanging="360"/>
+      </w:pPr>
+      <w:rPr>
+        <w:rFonts w:ascii="Wingdings" w:hAnsi="Wingdings" w:hint="default"/>
+        <w:sz w:val="20"/>
+      </w:rPr>
+    </w:lvl>
+    <w:lvl w:ilvl="5" w:tentative="1">
+      <w:start w:val="1"/>
+      <w:numFmt w:val="bullet"/>
+      <w:lvlText w:val=""/>
+      <w:lvlJc w:val="left"/>
+      <w:pPr>
+        <w:tabs>
+          <w:tab w:val="num" w:pos="4320"/>
+        </w:tabs>
+        <w:ind w:left="4320" w:hanging="360"/>
+      </w:pPr>
+      <w:rPr>
+        <w:rFonts w:ascii="Wingdings" w:hAnsi="Wingdings" w:hint="default"/>
+        <w:sz w:val="20"/>
+      </w:rPr>
+    </w:lvl>
+    <w:lvl w:ilvl="6" w:tentative="1">
+      <w:start w:val="1"/>
+      <w:numFmt w:val="bullet"/>
+      <w:lvlText w:val=""/>
+      <w:lvlJc w:val="left"/>
+      <w:pPr>
+        <w:tabs>
+          <w:tab w:val="num" w:pos="5040"/>
+        </w:tabs>
+        <w:ind w:left="5040" w:hanging="360"/>
+      </w:pPr>
+      <w:rPr>
+        <w:rFonts w:ascii="Wingdings" w:hAnsi="Wingdings" w:hint="default"/>
+        <w:sz w:val="20"/>
+      </w:rPr>
+    </w:lvl>
+    <w:lvl w:ilvl="7" w:tentative="1">
+      <w:start w:val="1"/>
+      <w:numFmt w:val="bullet"/>
+      <w:lvlText w:val=""/>
+      <w:lvlJc w:val="left"/>
+      <w:pPr>
+        <w:tabs>
+          <w:tab w:val="num" w:pos="5760"/>
+        </w:tabs>
+        <w:ind w:left="5760" w:hanging="360"/>
+      </w:pPr>
+      <w:rPr>
+        <w:rFonts w:ascii="Wingdings" w:hAnsi="Wingdings" w:hint="default"/>
+        <w:sz w:val="20"/>
+      </w:rPr>
+    </w:lvl>
+    <w:lvl w:ilvl="8" w:tentative="1">
+      <w:start w:val="1"/>
+      <w:numFmt w:val="bullet"/>
+      <w:lvlText w:val=""/>
+      <w:lvlJc w:val="left"/>
+      <w:pPr>
+        <w:tabs>
+          <w:tab w:val="num" w:pos="6480"/>
+        </w:tabs>
+        <w:ind w:left="6480" w:hanging="360"/>
+      </w:pPr>
+      <w:rPr>
+        <w:rFonts w:ascii="Wingdings" w:hAnsi="Wingdings" w:hint="default"/>
+        <w:sz w:val="20"/>
+      </w:rPr>
+    </w:lvl>
+  </w:abstractNum>
+  <w:abstractNum w:abstractNumId="1" w15:restartNumberingAfterBreak="0">
+    <w:nsid w:val="203300E6"/>
+    <w:multiLevelType w:val="multilevel"/>
+    <w:tmpl w:val="6BEA6BB6"/>
+    <w:lvl w:ilvl="0">
+      <w:start w:val="1"/>
+      <w:numFmt w:val="bullet"/>
+      <w:lvlText w:val=""/>
+      <w:lvlJc w:val="left"/>
+      <w:pPr>
+        <w:tabs>
+          <w:tab w:val="num" w:pos="720"/>
+        </w:tabs>
+        <w:ind w:left="720" w:hanging="360"/>
+      </w:pPr>
+      <w:rPr>
+        <w:rFonts w:ascii="Symbol" w:hAnsi="Symbol" w:hint="default"/>
+        <w:sz w:val="20"/>
+      </w:rPr>
+    </w:lvl>
+    <w:lvl w:ilvl="1" w:tentative="1">
+      <w:start w:val="1"/>
+      <w:numFmt w:val="bullet"/>
+      <w:lvlText w:val="o"/>
+      <w:lvlJc w:val="left"/>
+      <w:pPr>
+        <w:tabs>
+          <w:tab w:val="num" w:pos="1440"/>
+        </w:tabs>
+        <w:ind w:left="1440" w:hanging="360"/>
+      </w:pPr>
+      <w:rPr>
+        <w:rFonts w:ascii="Courier New" w:hAnsi="Courier New" w:hint="default"/>
+        <w:sz w:val="20"/>
+      </w:rPr>
+    </w:lvl>
+    <w:lvl w:ilvl="2" w:tentative="1">
+      <w:start w:val="1"/>
+      <w:numFmt w:val="bullet"/>
+      <w:lvlText w:val=""/>
+      <w:lvlJc w:val="left"/>
+      <w:pPr>
+        <w:tabs>
+          <w:tab w:val="num" w:pos="2160"/>
+        </w:tabs>
+        <w:ind w:left="2160" w:hanging="360"/>
+      </w:pPr>
+      <w:rPr>
+        <w:rFonts w:ascii="Wingdings" w:hAnsi="Wingdings" w:hint="default"/>
+        <w:sz w:val="20"/>
+      </w:rPr>
+    </w:lvl>
+    <w:lvl w:ilvl="3" w:tentative="1">
+      <w:start w:val="1"/>
+      <w:numFmt w:val="bullet"/>
+      <w:lvlText w:val=""/>
+      <w:lvlJc w:val="left"/>
+      <w:pPr>
+        <w:tabs>
+          <w:tab w:val="num" w:pos="2880"/>
+        </w:tabs>
+        <w:ind w:left="2880" w:hanging="360"/>
+      </w:pPr>
+      <w:rPr>
+        <w:rFonts w:ascii="Wingdings" w:hAnsi="Wingdings" w:hint="default"/>
+        <w:sz w:val="20"/>
+      </w:rPr>
+    </w:lvl>
+    <w:lvl w:ilvl="4" w:tentative="1">
+      <w:start w:val="1"/>
+      <w:numFmt w:val="bullet"/>
+      <w:lvlText w:val=""/>
+      <w:lvlJc w:val="left"/>
+      <w:pPr>
+        <w:tabs>
+          <w:tab w:val="num" w:pos="3600"/>
+        </w:tabs>
+        <w:ind w:left="3600" w:hanging="360"/>
+      </w:pPr>
+      <w:rPr>
+        <w:rFonts w:ascii="Wingdings" w:hAnsi="Wingdings" w:hint="default"/>
+        <w:sz w:val="20"/>
+      </w:rPr>
+    </w:lvl>
+    <w:lvl w:ilvl="5" w:tentative="1">
+      <w:start w:val="1"/>
+      <w:numFmt w:val="bullet"/>
+      <w:lvlText w:val=""/>
+      <w:lvlJc w:val="left"/>
+      <w:pPr>
+        <w:tabs>
+          <w:tab w:val="num" w:pos="4320"/>
+        </w:tabs>
+        <w:ind w:left="4320" w:hanging="360"/>
+      </w:pPr>
+      <w:rPr>
+        <w:rFonts w:ascii="Wingdings" w:hAnsi="Wingdings" w:hint="default"/>
+        <w:sz w:val="20"/>
+      </w:rPr>
+    </w:lvl>
+    <w:lvl w:ilvl="6" w:tentative="1">
+      <w:start w:val="1"/>
+      <w:numFmt w:val="bullet"/>
+      <w:lvlText w:val=""/>
+      <w:lvlJc w:val="left"/>
+      <w:pPr>
+        <w:tabs>
+          <w:tab w:val="num" w:pos="5040"/>
+        </w:tabs>
+        <w:ind w:left="5040" w:hanging="360"/>
+      </w:pPr>
+      <w:rPr>
+        <w:rFonts w:ascii="Wingdings" w:hAnsi="Wingdings" w:hint="default"/>
+        <w:sz w:val="20"/>
+      </w:rPr>
+    </w:lvl>
+    <w:lvl w:ilvl="7" w:tentative="1">
+      <w:start w:val="1"/>
+      <w:numFmt w:val="bullet"/>
+      <w:lvlText w:val=""/>
+      <w:lvlJc w:val="left"/>
+      <w:pPr>
+        <w:tabs>
+          <w:tab w:val="num" w:pos="5760"/>
+        </w:tabs>
+        <w:ind w:left="5760" w:hanging="360"/>
+      </w:pPr>
+      <w:rPr>
+        <w:rFonts w:ascii="Wingdings" w:hAnsi="Wingdings" w:hint="default"/>
+        <w:sz w:val="20"/>
+      </w:rPr>
+    </w:lvl>
+    <w:lvl w:ilvl="8" w:tentative="1">
+      <w:start w:val="1"/>
+      <w:numFmt w:val="bullet"/>
+      <w:lvlText w:val=""/>
+      <w:lvlJc w:val="left"/>
+      <w:pPr>
+        <w:tabs>
+          <w:tab w:val="num" w:pos="6480"/>
+        </w:tabs>
+        <w:ind w:left="6480" w:hanging="360"/>
+      </w:pPr>
+      <w:rPr>
+        <w:rFonts w:ascii="Wingdings" w:hAnsi="Wingdings" w:hint="default"/>
+        <w:sz w:val="20"/>
+      </w:rPr>
+    </w:lvl>
+  </w:abstractNum>
+  <w:abstractNum w:abstractNumId="2" w15:restartNumberingAfterBreak="0">
     <w:nsid w:val="662A131E"/>
     <w:multiLevelType w:val="hybridMultilevel"/>
     <w:tmpl w:val="342CDFB8"/>
@@ -1355,7 +2213,13 @@
     </w:lvl>
   </w:abstractNum>
   <w:num w:numId="1" w16cid:durableId="1729450730">
+    <w:abstractNumId w:val="2"/>
+  </w:num>
+  <w:num w:numId="2" w16cid:durableId="1360663209">
     <w:abstractNumId w:val="0"/>
+  </w:num>
+  <w:num w:numId="3" w16cid:durableId="1112362345">
+    <w:abstractNumId w:val="1"/>
   </w:num>
 </w:numbering>
 </file>
@@ -1755,7 +2619,7 @@
     <w:name w:val="Normal"/>
     <w:qFormat/>
   </w:style>
-  <w:style w:type="paragraph" w:styleId="Rubrik1">
+  <w:style w:type="paragraph" w:styleId="Heading1">
     <w:name w:val="heading 1"/>
     <w:basedOn w:val="Normal"/>
     <w:next w:val="Normal"/>
@@ -1774,7 +2638,7 @@
       <w:szCs w:val="32"/>
     </w:rPr>
   </w:style>
-  <w:style w:type="paragraph" w:styleId="Rubrik2">
+  <w:style w:type="paragraph" w:styleId="Heading2">
     <w:name w:val="heading 2"/>
     <w:basedOn w:val="Normal"/>
     <w:next w:val="Normal"/>
@@ -1794,11 +2658,11 @@
       <w:szCs w:val="36"/>
     </w:rPr>
   </w:style>
-  <w:style w:type="paragraph" w:styleId="Rubrik3">
+  <w:style w:type="paragraph" w:styleId="Heading3">
     <w:name w:val="heading 3"/>
     <w:basedOn w:val="Normal"/>
     <w:next w:val="Normal"/>
-    <w:link w:val="Rubrik3Char"/>
+    <w:link w:val="Heading3Char"/>
     <w:uiPriority w:val="9"/>
     <w:unhideWhenUsed/>
     <w:qFormat/>
@@ -1815,7 +2679,7 @@
       <w:szCs w:val="26"/>
     </w:rPr>
   </w:style>
-  <w:style w:type="paragraph" w:styleId="Rubrik4">
+  <w:style w:type="paragraph" w:styleId="Heading4">
     <w:name w:val="heading 4"/>
     <w:basedOn w:val="Normal"/>
     <w:next w:val="Normal"/>
@@ -1834,7 +2698,7 @@
       <w:bCs/>
     </w:rPr>
   </w:style>
-  <w:style w:type="paragraph" w:styleId="Rubrik5">
+  <w:style w:type="paragraph" w:styleId="Heading5">
     <w:name w:val="heading 5"/>
     <w:basedOn w:val="Normal"/>
     <w:next w:val="Normal"/>
@@ -1855,7 +2719,7 @@
       <w:szCs w:val="22"/>
     </w:rPr>
   </w:style>
-  <w:style w:type="paragraph" w:styleId="Rubrik6">
+  <w:style w:type="paragraph" w:styleId="Heading6">
     <w:name w:val="heading 6"/>
     <w:basedOn w:val="Normal"/>
     <w:next w:val="Normal"/>
@@ -1876,13 +2740,13 @@
       <w:szCs w:val="20"/>
     </w:rPr>
   </w:style>
-  <w:style w:type="character" w:default="1" w:styleId="Standardstycketeckensnitt">
+  <w:style w:type="character" w:default="1" w:styleId="DefaultParagraphFont">
     <w:name w:val="Default Paragraph Font"/>
     <w:uiPriority w:val="1"/>
     <w:semiHidden/>
     <w:unhideWhenUsed/>
   </w:style>
-  <w:style w:type="table" w:default="1" w:styleId="Normaltabell">
+  <w:style w:type="table" w:default="1" w:styleId="TableNormal">
     <w:name w:val="Normal Table"/>
     <w:uiPriority w:val="99"/>
     <w:semiHidden/>
@@ -1897,13 +2761,13 @@
       </w:tblCellMar>
     </w:tblPr>
   </w:style>
-  <w:style w:type="numbering" w:default="1" w:styleId="Ingenlista">
+  <w:style w:type="numbering" w:default="1" w:styleId="NoList">
     <w:name w:val="No List"/>
     <w:uiPriority w:val="99"/>
     <w:semiHidden/>
     <w:unhideWhenUsed/>
   </w:style>
-  <w:style w:type="table" w:customStyle="1" w:styleId="TableNormal">
+  <w:style w:type="table" w:customStyle="1" w:styleId="TableNormal0">
     <w:name w:val="TableNormal"/>
     <w:tblPr>
       <w:tblCellMar>
@@ -1914,7 +2778,7 @@
       </w:tblCellMar>
     </w:tblPr>
   </w:style>
-  <w:style w:type="paragraph" w:styleId="Rubrik">
+  <w:style w:type="paragraph" w:styleId="Title">
     <w:name w:val="Title"/>
     <w:basedOn w:val="Normal"/>
     <w:next w:val="Normal"/>
@@ -1947,7 +2811,7 @@
       <w:lang w:val="en-US" w:eastAsia="en-US"/>
     </w:rPr>
   </w:style>
-  <w:style w:type="paragraph" w:styleId="Sidfot">
+  <w:style w:type="paragraph" w:styleId="Footer">
     <w:name w:val="footer"/>
     <w:basedOn w:val="Normal"/>
     <w:rsid w:val="003F3001"/>
@@ -1965,9 +2829,9 @@
       <w:lang w:val="en-US" w:eastAsia="en-US"/>
     </w:rPr>
   </w:style>
-  <w:style w:type="character" w:customStyle="1" w:styleId="Rubrik3Char">
-    <w:name w:val="Rubrik 3 Char"/>
-    <w:link w:val="Rubrik3"/>
+  <w:style w:type="character" w:customStyle="1" w:styleId="Heading3Char">
+    <w:name w:val="Heading 3 Char"/>
+    <w:link w:val="Heading3"/>
     <w:rsid w:val="003F3001"/>
     <w:rPr>
       <w:rFonts w:ascii="Arial" w:hAnsi="Arial" w:cs="Arial"/>
@@ -1978,7 +2842,7 @@
       <w:lang w:val="sv-SE" w:eastAsia="sv-SE" w:bidi="ar-SA"/>
     </w:rPr>
   </w:style>
-  <w:style w:type="paragraph" w:styleId="Brdtext">
+  <w:style w:type="paragraph" w:styleId="BodyText">
     <w:name w:val="Body Text"/>
     <w:basedOn w:val="Normal"/>
     <w:rsid w:val="00116362"/>
@@ -1994,7 +2858,7 @@
       <w:lang w:val="en-US" w:eastAsia="en-US"/>
     </w:rPr>
   </w:style>
-  <w:style w:type="paragraph" w:styleId="Underrubrik">
+  <w:style w:type="paragraph" w:styleId="Subtitle">
     <w:name w:val="Subtitle"/>
     <w:basedOn w:val="Normal"/>
     <w:next w:val="Normal"/>
@@ -2015,7 +2879,7 @@
     </w:rPr>
   </w:style>
   <w:style w:type="table" w:customStyle="1" w:styleId="a">
-    <w:basedOn w:val="Normaltabell"/>
+    <w:basedOn w:val="TableNormal"/>
     <w:tblPr>
       <w:tblStyleRowBandSize w:val="1"/>
       <w:tblStyleColBandSize w:val="1"/>
@@ -2026,7 +2890,7 @@
     </w:tblPr>
   </w:style>
   <w:style w:type="table" w:customStyle="1" w:styleId="a0">
-    <w:basedOn w:val="Normaltabell"/>
+    <w:basedOn w:val="TableNormal"/>
     <w:tblPr>
       <w:tblStyleRowBandSize w:val="1"/>
       <w:tblStyleColBandSize w:val="1"/>
@@ -2036,7 +2900,7 @@
       </w:tblCellMar>
     </w:tblPr>
   </w:style>
-  <w:style w:type="paragraph" w:styleId="Liststycke">
+  <w:style w:type="paragraph" w:styleId="ListParagraph">
     <w:name w:val="List Paragraph"/>
     <w:basedOn w:val="Normal"/>
     <w:uiPriority w:val="34"/>

</xml_diff>

<commit_message>
artifacts: update vision, req and risks. Added light logic for arduino gas alarm logic (#149)
* artifacts: update vision, req and risks. Added light logic for arduino gas alarm logic

* Add and update Artifacts word + pdf files

---------

Co-authored-by: must-Zeus0036 <mustafa.al-bayati0036@stud.hkr.se>
</commit_message>
<xml_diff>
--- a/SG3_Devices/SG3_Artifacts/SG3_SupplReqs.docx
+++ b/SG3_Devices/SG3_Artifacts/SG3_SupplReqs.docx
@@ -4,7 +4,7 @@
   <w:body>
     <w:p>
       <w:pPr>
-        <w:pStyle w:val="Rubrik1"/>
+        <w:pStyle w:val="Heading1"/>
       </w:pPr>
       <w:r>
         <w:t xml:space="preserve">Supplementary Requirements Documentation </w:t>
@@ -13,7 +13,7 @@
     <w:p/>
     <w:p>
       <w:pPr>
-        <w:pStyle w:val="Rubrik1"/>
+        <w:pStyle w:val="Heading1"/>
       </w:pPr>
       <w:r>
         <w:t>Interactive House Project</w:t>
@@ -26,7 +26,7 @@
     <w:p/>
     <w:p>
       <w:pPr>
-        <w:pStyle w:val="Rubrik"/>
+        <w:pStyle w:val="Title"/>
       </w:pPr>
       <w:r>
         <w:t>Revision History</w:t>
@@ -362,8 +362,18 @@
                 <w:sz w:val="20"/>
                 <w:szCs w:val="20"/>
               </w:rPr>
-              <w:t>Sergej Macut</w:t>
-            </w:r>
+              <w:t xml:space="preserve">Sergej </w:t>
+            </w:r>
+            <w:proofErr w:type="spellStart"/>
+            <w:r>
+              <w:rPr>
+                <w:color w:val="000000"/>
+                <w:sz w:val="20"/>
+                <w:szCs w:val="20"/>
+              </w:rPr>
+              <w:t>Macut</w:t>
+            </w:r>
+            <w:proofErr w:type="spellEnd"/>
           </w:p>
         </w:tc>
       </w:tr>
@@ -504,8 +514,17 @@
                 <w:sz w:val="20"/>
                 <w:szCs w:val="20"/>
               </w:rPr>
-              <w:t>Sergej Macut</w:t>
-            </w:r>
+              <w:t xml:space="preserve">Sergej </w:t>
+            </w:r>
+            <w:proofErr w:type="spellStart"/>
+            <w:r>
+              <w:rPr>
+                <w:sz w:val="20"/>
+                <w:szCs w:val="20"/>
+              </w:rPr>
+              <w:t>Macut</w:t>
+            </w:r>
+            <w:proofErr w:type="spellEnd"/>
           </w:p>
         </w:tc>
       </w:tr>
@@ -655,15 +674,161 @@
           </w:p>
         </w:tc>
       </w:tr>
+      <w:tr>
+        <w:tc>
+          <w:tcPr>
+            <w:tcW w:w="2304" w:type="dxa"/>
+            <w:tcMar>
+              <w:top w:w="0" w:type="dxa"/>
+              <w:bottom w:w="0" w:type="dxa"/>
+            </w:tcMar>
+          </w:tcPr>
+          <w:p>
+            <w:pPr>
+              <w:keepLines/>
+              <w:widowControl w:val="0"/>
+              <w:pBdr>
+                <w:top w:val="nil"/>
+                <w:left w:val="nil"/>
+                <w:bottom w:val="nil"/>
+                <w:right w:val="nil"/>
+                <w:between w:val="nil"/>
+              </w:pBdr>
+              <w:spacing w:after="120"/>
+              <w:rPr>
+                <w:color w:val="000000"/>
+                <w:sz w:val="20"/>
+                <w:szCs w:val="20"/>
+              </w:rPr>
+            </w:pPr>
+            <w:r>
+              <w:rPr>
+                <w:color w:val="000000"/>
+                <w:sz w:val="20"/>
+                <w:szCs w:val="20"/>
+              </w:rPr>
+              <w:t>2026-04-23</w:t>
+            </w:r>
+          </w:p>
+        </w:tc>
+        <w:tc>
+          <w:tcPr>
+            <w:tcW w:w="1152" w:type="dxa"/>
+            <w:tcMar>
+              <w:top w:w="0" w:type="dxa"/>
+              <w:bottom w:w="0" w:type="dxa"/>
+            </w:tcMar>
+          </w:tcPr>
+          <w:p>
+            <w:pPr>
+              <w:keepLines/>
+              <w:widowControl w:val="0"/>
+              <w:pBdr>
+                <w:top w:val="nil"/>
+                <w:left w:val="nil"/>
+                <w:bottom w:val="nil"/>
+                <w:right w:val="nil"/>
+                <w:between w:val="nil"/>
+              </w:pBdr>
+              <w:spacing w:after="120"/>
+              <w:rPr>
+                <w:color w:val="000000"/>
+                <w:sz w:val="20"/>
+                <w:szCs w:val="20"/>
+              </w:rPr>
+            </w:pPr>
+            <w:r>
+              <w:rPr>
+                <w:color w:val="000000"/>
+                <w:sz w:val="20"/>
+                <w:szCs w:val="20"/>
+              </w:rPr>
+              <w:t>1.3</w:t>
+            </w:r>
+          </w:p>
+        </w:tc>
+        <w:tc>
+          <w:tcPr>
+            <w:tcW w:w="3744" w:type="dxa"/>
+            <w:tcMar>
+              <w:top w:w="0" w:type="dxa"/>
+              <w:bottom w:w="0" w:type="dxa"/>
+            </w:tcMar>
+          </w:tcPr>
+          <w:p>
+            <w:pPr>
+              <w:keepLines/>
+              <w:widowControl w:val="0"/>
+              <w:pBdr>
+                <w:top w:val="nil"/>
+                <w:left w:val="nil"/>
+                <w:bottom w:val="nil"/>
+                <w:right w:val="nil"/>
+                <w:between w:val="nil"/>
+              </w:pBdr>
+              <w:spacing w:after="120"/>
+              <w:rPr>
+                <w:color w:val="000000"/>
+                <w:sz w:val="20"/>
+                <w:szCs w:val="20"/>
+              </w:rPr>
+            </w:pPr>
+            <w:r>
+              <w:rPr>
+                <w:color w:val="000000"/>
+                <w:sz w:val="20"/>
+                <w:szCs w:val="20"/>
+              </w:rPr>
+              <w:t>Autonomous Safety &amp; Environmental Responsiveness</w:t>
+            </w:r>
+          </w:p>
+        </w:tc>
+        <w:tc>
+          <w:tcPr>
+            <w:tcW w:w="2304" w:type="dxa"/>
+            <w:tcMar>
+              <w:top w:w="0" w:type="dxa"/>
+              <w:bottom w:w="0" w:type="dxa"/>
+            </w:tcMar>
+          </w:tcPr>
+          <w:p>
+            <w:pPr>
+              <w:keepLines/>
+              <w:widowControl w:val="0"/>
+              <w:pBdr>
+                <w:top w:val="nil"/>
+                <w:left w:val="nil"/>
+                <w:bottom w:val="nil"/>
+                <w:right w:val="nil"/>
+                <w:between w:val="nil"/>
+              </w:pBdr>
+              <w:spacing w:after="120"/>
+              <w:rPr>
+                <w:color w:val="000000"/>
+                <w:sz w:val="20"/>
+                <w:szCs w:val="20"/>
+              </w:rPr>
+            </w:pPr>
+            <w:r>
+              <w:rPr>
+                <w:color w:val="000000"/>
+                <w:sz w:val="20"/>
+                <w:szCs w:val="20"/>
+              </w:rPr>
+              <w:t>Mustafa Al-Bayati</w:t>
+            </w:r>
+          </w:p>
+        </w:tc>
+      </w:tr>
     </w:tbl>
     <w:p>
       <w:pPr>
-        <w:pStyle w:val="Rubrik3"/>
-      </w:pPr>
-    </w:p>
-    <w:p>
-      <w:pPr>
-        <w:pStyle w:val="Rubrik"/>
+        <w:pStyle w:val="Heading3"/>
+      </w:pPr>
+    </w:p>
+    <w:p>
+      <w:pPr>
+        <w:pStyle w:val="Title"/>
       </w:pPr>
       <w:r>
         <w:t>Supplementary Requirements List</w:t>
@@ -868,7 +1033,15 @@
               <w:spacing w:before="120" w:after="120"/>
             </w:pPr>
             <w:r>
-              <w:t>S2.Performance - Response Latency</w:t>
+              <w:t>S</w:t>
+            </w:r>
+            <w:proofErr w:type="gramStart"/>
+            <w:r>
+              <w:t>2.Performance</w:t>
+            </w:r>
+            <w:proofErr w:type="gramEnd"/>
+            <w:r>
+              <w:t xml:space="preserve"> - Response Latency</w:t>
             </w:r>
           </w:p>
         </w:tc>
@@ -1083,10 +1256,66 @@
           </w:p>
         </w:tc>
       </w:tr>
+      <w:tr>
+        <w:trPr>
+          <w:trHeight w:val="546"/>
+        </w:trPr>
+        <w:tc>
+          <w:tcPr>
+            <w:tcW w:w="5306" w:type="dxa"/>
+            <w:tcMar>
+              <w:top w:w="0" w:type="dxa"/>
+              <w:bottom w:w="0" w:type="dxa"/>
+            </w:tcMar>
+          </w:tcPr>
+          <w:p>
+            <w:r>
+              <w:t>S6. Autonomous Safety &amp; Environmental Responsiveness</w:t>
+            </w:r>
+          </w:p>
+        </w:tc>
+        <w:tc>
+          <w:tcPr>
+            <w:tcW w:w="3906" w:type="dxa"/>
+            <w:tcMar>
+              <w:top w:w="0" w:type="dxa"/>
+              <w:bottom w:w="0" w:type="dxa"/>
+            </w:tcMar>
+          </w:tcPr>
+          <w:p>
+            <w:pPr>
+              <w:widowControl w:val="0"/>
+              <w:pBdr>
+                <w:top w:val="nil"/>
+                <w:left w:val="nil"/>
+                <w:bottom w:val="nil"/>
+                <w:right w:val="nil"/>
+                <w:between w:val="nil"/>
+              </w:pBdr>
+              <w:tabs>
+                <w:tab w:val="center" w:pos="4320"/>
+                <w:tab w:val="right" w:pos="8640"/>
+              </w:tabs>
+              <w:jc w:val="center"/>
+              <w:rPr>
+                <w:sz w:val="20"/>
+                <w:szCs w:val="20"/>
+              </w:rPr>
+            </w:pPr>
+            <w:r>
+              <w:rPr>
+                <w:sz w:val="20"/>
+                <w:szCs w:val="20"/>
+              </w:rPr>
+              <w:t>Essential</w:t>
+            </w:r>
+          </w:p>
+        </w:tc>
+      </w:tr>
     </w:tbl>
     <w:p>
       <w:pPr>
-        <w:pStyle w:val="Rubrik"/>
+        <w:pStyle w:val="Title"/>
       </w:pPr>
       <w:r>
         <w:br w:type="page"/>
@@ -1094,7 +1323,7 @@
     </w:p>
     <w:p>
       <w:pPr>
-        <w:pStyle w:val="Rubrik"/>
+        <w:pStyle w:val="Title"/>
       </w:pPr>
       <w:r>
         <w:lastRenderedPageBreak/>
@@ -1105,9 +1334,33 @@
     <w:p>
       <w:pPr>
         <w:spacing w:line="360" w:lineRule="auto"/>
-      </w:pPr>
-      <w:r>
-        <w:t>S1. Interoperability - Middleman Architecture</w:t>
+        <w:rPr>
+          <w:b/>
+          <w:bCs/>
+        </w:rPr>
+      </w:pPr>
+      <w:r>
+        <w:rPr>
+          <w:b/>
+          <w:bCs/>
+        </w:rPr>
+        <w:t>S1</w:t>
+      </w:r>
+    </w:p>
+    <w:p>
+      <w:pPr>
+        <w:spacing w:line="360" w:lineRule="auto"/>
+        <w:rPr>
+          <w:b/>
+          <w:bCs/>
+        </w:rPr>
+      </w:pPr>
+      <w:r>
+        <w:rPr>
+          <w:b/>
+          <w:bCs/>
+        </w:rPr>
+        <w:t>Interoperability - Middleman Architecture</w:t>
       </w:r>
     </w:p>
     <w:p>
@@ -1126,9 +1379,33 @@
     <w:p>
       <w:pPr>
         <w:spacing w:line="360" w:lineRule="auto"/>
-      </w:pPr>
-      <w:r>
-        <w:t>S2. Performance - Response Latency</w:t>
+        <w:rPr>
+          <w:b/>
+          <w:bCs/>
+        </w:rPr>
+      </w:pPr>
+      <w:r>
+        <w:rPr>
+          <w:b/>
+          <w:bCs/>
+        </w:rPr>
+        <w:t>S2</w:t>
+      </w:r>
+    </w:p>
+    <w:p>
+      <w:pPr>
+        <w:spacing w:line="360" w:lineRule="auto"/>
+        <w:rPr>
+          <w:b/>
+          <w:bCs/>
+        </w:rPr>
+      </w:pPr>
+      <w:r>
+        <w:rPr>
+          <w:b/>
+          <w:bCs/>
+        </w:rPr>
+        <w:t>Performance - Response Latency</w:t>
       </w:r>
     </w:p>
     <w:p>
@@ -1147,9 +1424,33 @@
     <w:p>
       <w:pPr>
         <w:spacing w:line="360" w:lineRule="auto"/>
-      </w:pPr>
-      <w:r>
-        <w:t>S3. Reliability - Simulation Stability</w:t>
+        <w:rPr>
+          <w:b/>
+          <w:bCs/>
+        </w:rPr>
+      </w:pPr>
+      <w:r>
+        <w:rPr>
+          <w:b/>
+          <w:bCs/>
+        </w:rPr>
+        <w:t>S3</w:t>
+      </w:r>
+    </w:p>
+    <w:p>
+      <w:pPr>
+        <w:spacing w:line="360" w:lineRule="auto"/>
+        <w:rPr>
+          <w:b/>
+          <w:bCs/>
+        </w:rPr>
+      </w:pPr>
+      <w:r>
+        <w:rPr>
+          <w:b/>
+          <w:bCs/>
+        </w:rPr>
+        <w:t>Reliability - Simulation Stability</w:t>
       </w:r>
     </w:p>
     <w:p>
@@ -1168,9 +1469,33 @@
     <w:p>
       <w:pPr>
         <w:spacing w:line="360" w:lineRule="auto"/>
-      </w:pPr>
-      <w:r>
-        <w:t>S4. Design Language - UML Standards</w:t>
+        <w:rPr>
+          <w:b/>
+          <w:bCs/>
+        </w:rPr>
+      </w:pPr>
+      <w:r>
+        <w:rPr>
+          <w:b/>
+          <w:bCs/>
+        </w:rPr>
+        <w:t>S4</w:t>
+      </w:r>
+    </w:p>
+    <w:p>
+      <w:pPr>
+        <w:spacing w:line="360" w:lineRule="auto"/>
+        <w:rPr>
+          <w:b/>
+          <w:bCs/>
+        </w:rPr>
+      </w:pPr>
+      <w:r>
+        <w:rPr>
+          <w:b/>
+          <w:bCs/>
+        </w:rPr>
+        <w:t>Design Language - UML Standards</w:t>
       </w:r>
     </w:p>
     <w:p>
@@ -1189,9 +1514,33 @@
     <w:p>
       <w:pPr>
         <w:spacing w:line="360" w:lineRule="auto"/>
-      </w:pPr>
-      <w:r>
-        <w:t>S5. Fault Handling – Communication Robustness</w:t>
+        <w:rPr>
+          <w:b/>
+          <w:bCs/>
+        </w:rPr>
+      </w:pPr>
+      <w:r>
+        <w:rPr>
+          <w:b/>
+          <w:bCs/>
+        </w:rPr>
+        <w:t>S5</w:t>
+      </w:r>
+    </w:p>
+    <w:p>
+      <w:pPr>
+        <w:spacing w:line="360" w:lineRule="auto"/>
+        <w:rPr>
+          <w:b/>
+          <w:bCs/>
+        </w:rPr>
+      </w:pPr>
+      <w:r>
+        <w:rPr>
+          <w:b/>
+          <w:bCs/>
+        </w:rPr>
+        <w:t>Fault Handling – Communication Robustness</w:t>
       </w:r>
     </w:p>
     <w:p>
@@ -1204,7 +1553,7 @@
     </w:p>
     <w:p>
       <w:pPr>
-        <w:pStyle w:val="Liststycke"/>
+        <w:pStyle w:val="ListParagraph"/>
         <w:spacing w:line="360" w:lineRule="auto"/>
       </w:pPr>
       <w:r>
@@ -1213,7 +1562,7 @@
     </w:p>
     <w:p>
       <w:pPr>
-        <w:pStyle w:val="Liststycke"/>
+        <w:pStyle w:val="ListParagraph"/>
         <w:spacing w:line="360" w:lineRule="auto"/>
       </w:pPr>
       <w:r>
@@ -1222,12 +1571,223 @@
     </w:p>
     <w:p>
       <w:pPr>
-        <w:pStyle w:val="Liststycke"/>
+        <w:pStyle w:val="ListParagraph"/>
         <w:spacing w:line="360" w:lineRule="auto"/>
       </w:pPr>
       <w:r>
         <w:t>Maintain the last known valid device state.</w:t>
       </w:r>
+    </w:p>
+    <w:p>
+      <w:pPr>
+        <w:pStyle w:val="ListParagraph"/>
+        <w:spacing w:line="360" w:lineRule="auto"/>
+      </w:pPr>
+    </w:p>
+    <w:p>
+      <w:pPr>
+        <w:spacing w:line="360" w:lineRule="auto"/>
+        <w:rPr>
+          <w:b/>
+          <w:bCs/>
+        </w:rPr>
+      </w:pPr>
+      <w:r>
+        <w:rPr>
+          <w:b/>
+          <w:bCs/>
+        </w:rPr>
+        <w:lastRenderedPageBreak/>
+        <w:t>S6</w:t>
+      </w:r>
+    </w:p>
+    <w:p>
+      <w:pPr>
+        <w:spacing w:line="360" w:lineRule="auto"/>
+        <w:rPr>
+          <w:b/>
+          <w:bCs/>
+        </w:rPr>
+      </w:pPr>
+      <w:r>
+        <w:rPr>
+          <w:b/>
+          <w:bCs/>
+        </w:rPr>
+        <w:t>Autonomous Safety &amp; Environmental Responsiveness</w:t>
+      </w:r>
+    </w:p>
+    <w:p>
+      <w:pPr>
+        <w:spacing w:line="360" w:lineRule="auto"/>
+        <w:rPr>
+          <w:lang w:val="en-SE"/>
+        </w:rPr>
+      </w:pPr>
+      <w:r>
+        <w:rPr>
+          <w:lang w:val="en-SE"/>
+        </w:rPr>
+        <w:t xml:space="preserve">The device must be capable of reacting to environmental conditions </w:t>
+      </w:r>
+      <w:r>
+        <w:rPr>
+          <w:b/>
+          <w:bCs/>
+          <w:lang w:val="en-SE"/>
+        </w:rPr>
+        <w:t>independently of external systems (Gateway or Server)</w:t>
+      </w:r>
+      <w:r>
+        <w:rPr>
+          <w:lang w:val="en-SE"/>
+        </w:rPr>
+        <w:t>.</w:t>
+      </w:r>
+    </w:p>
+    <w:p>
+      <w:pPr>
+        <w:spacing w:line="360" w:lineRule="auto"/>
+        <w:rPr>
+          <w:lang w:val="en-SE"/>
+        </w:rPr>
+      </w:pPr>
+      <w:r>
+        <w:rPr>
+          <w:lang w:val="en-SE"/>
+        </w:rPr>
+        <w:t>This includes:</w:t>
+      </w:r>
+    </w:p>
+    <w:p>
+      <w:pPr>
+        <w:numPr>
+          <w:ilvl w:val="0"/>
+          <w:numId w:val="2"/>
+        </w:numPr>
+        <w:spacing w:line="360" w:lineRule="auto"/>
+        <w:rPr>
+          <w:lang w:val="en-SE"/>
+        </w:rPr>
+      </w:pPr>
+      <w:r>
+        <w:rPr>
+          <w:lang w:val="en-SE"/>
+        </w:rPr>
+        <w:t xml:space="preserve">Detecting hazardous conditions (gas, fire, extreme temperature) </w:t>
+      </w:r>
+    </w:p>
+    <w:p>
+      <w:pPr>
+        <w:numPr>
+          <w:ilvl w:val="0"/>
+          <w:numId w:val="2"/>
+        </w:numPr>
+        <w:spacing w:line="360" w:lineRule="auto"/>
+        <w:rPr>
+          <w:lang w:val="en-SE"/>
+        </w:rPr>
+      </w:pPr>
+      <w:r>
+        <w:rPr>
+          <w:lang w:val="en-SE"/>
+        </w:rPr>
+        <w:t xml:space="preserve">Responding immediately with appropriate actuator actions </w:t>
+      </w:r>
+    </w:p>
+    <w:p>
+      <w:pPr>
+        <w:numPr>
+          <w:ilvl w:val="0"/>
+          <w:numId w:val="2"/>
+        </w:numPr>
+        <w:spacing w:line="360" w:lineRule="auto"/>
+        <w:rPr>
+          <w:lang w:val="en-SE"/>
+        </w:rPr>
+      </w:pPr>
+      <w:r>
+        <w:rPr>
+          <w:lang w:val="en-SE"/>
+        </w:rPr>
+        <w:t>Ensuring safety-critical responses occur even during communication failure</w:t>
+      </w:r>
+    </w:p>
+    <w:p>
+      <w:pPr>
+        <w:spacing w:line="360" w:lineRule="auto"/>
+        <w:rPr>
+          <w:lang w:val="en-SE"/>
+        </w:rPr>
+      </w:pPr>
+      <w:r>
+        <w:rPr>
+          <w:lang w:val="en-SE"/>
+        </w:rPr>
+        <w:t>Examples:</w:t>
+      </w:r>
+    </w:p>
+    <w:p>
+      <w:pPr>
+        <w:numPr>
+          <w:ilvl w:val="0"/>
+          <w:numId w:val="3"/>
+        </w:numPr>
+        <w:spacing w:line="360" w:lineRule="auto"/>
+        <w:rPr>
+          <w:lang w:val="en-SE"/>
+        </w:rPr>
+      </w:pPr>
+      <w:r>
+        <w:rPr>
+          <w:lang w:val="en-SE"/>
+        </w:rPr>
+        <w:t xml:space="preserve">Gas detected → trigger buzzer immediately </w:t>
+      </w:r>
+    </w:p>
+    <w:p>
+      <w:pPr>
+        <w:numPr>
+          <w:ilvl w:val="0"/>
+          <w:numId w:val="3"/>
+        </w:numPr>
+        <w:spacing w:line="360" w:lineRule="auto"/>
+        <w:rPr>
+          <w:lang w:val="en-SE"/>
+        </w:rPr>
+      </w:pPr>
+      <w:r>
+        <w:rPr>
+          <w:lang w:val="en-SE"/>
+        </w:rPr>
+        <w:t xml:space="preserve">Rain detected → close window without waiting for server </w:t>
+      </w:r>
+    </w:p>
+    <w:p>
+      <w:pPr>
+        <w:numPr>
+          <w:ilvl w:val="0"/>
+          <w:numId w:val="3"/>
+        </w:numPr>
+        <w:spacing w:line="360" w:lineRule="auto"/>
+        <w:rPr>
+          <w:lang w:val="en-SE"/>
+        </w:rPr>
+      </w:pPr>
+      <w:r>
+        <w:rPr>
+          <w:lang w:val="en-SE"/>
+        </w:rPr>
+        <w:t>Fire risk → open door and activate alarm</w:t>
+      </w:r>
+    </w:p>
+    <w:p>
+      <w:pPr>
+        <w:spacing w:line="360" w:lineRule="auto"/>
+        <w:rPr>
+          <w:lang w:val="en-SE"/>
+        </w:rPr>
+      </w:pPr>
     </w:p>
     <w:sectPr>
       <w:pgSz w:w="11906" w:h="16838"/>
@@ -1242,6 +1802,304 @@
 <file path=word/numbering.xml><?xml version="1.0" encoding="utf-8"?>
 <w:numbering xmlns:wpc="http://schemas.microsoft.com/office/word/2010/wordprocessingCanvas" xmlns:cx="http://schemas.microsoft.com/office/drawing/2014/chartex" xmlns:cx1="http://schemas.microsoft.com/office/drawing/2015/9/8/chartex" xmlns:cx2="http://schemas.microsoft.com/office/drawing/2015/10/21/chartex" xmlns:cx3="http://schemas.microsoft.com/office/drawing/2016/5/9/chartex" xmlns:cx4="http://schemas.microsoft.com/office/drawing/2016/5/10/chartex" xmlns:cx5="http://schemas.microsoft.com/office/drawing/2016/5/11/chartex" xmlns:cx6="http://schemas.microsoft.com/office/drawing/2016/5/12/chartex" xmlns:cx7="http://schemas.microsoft.com/office/drawing/2016/5/13/chartex" xmlns:cx8="http://schemas.microsoft.com/office/drawing/2016/5/14/chartex" xmlns:mc="http://schemas.openxmlformats.org/markup-compatibility/2006" xmlns:aink="http://schemas.microsoft.com/office/drawing/2016/ink" xmlns:am3d="http://schemas.microsoft.com/office/drawing/2017/model3d" xmlns:o="urn:schemas-microsoft-com:office:office" xmlns:oel="http://schemas.microsoft.com/office/2019/extlst" xmlns:r="http://schemas.openxmlformats.org/officeDocument/2006/relationships" xmlns:m="http://schemas.openxmlformats.org/officeDocument/2006/math" xmlns:v="urn:schemas-microsoft-com:vml" xmlns:wp14="http://schemas.microsoft.com/office/word/2010/wordprocessingDrawing" xmlns:wp="http://schemas.openxmlformats.org/drawingml/2006/wordprocessingDrawing" xmlns:w10="urn:schemas-microsoft-com:office:word" xmlns:w="http://schemas.openxmlformats.org/wordprocessingml/2006/main" xmlns:w14="http://schemas.microsoft.com/office/word/2010/wordml" xmlns:w15="http://schemas.microsoft.com/office/word/2012/wordml" xmlns:w16cex="http://schemas.microsoft.com/office/word/2018/wordml/cex" xmlns:w16cid="http://schemas.microsoft.com/office/word/2016/wordml/cid" xmlns:w16="http://schemas.microsoft.com/office/word/2018/wordml" xmlns:w16du="http://schemas.microsoft.com/office/word/2023/wordml/word16du" xmlns:w16sdtdh="http://schemas.microsoft.com/office/word/2020/wordml/sdtdatahash" xmlns:w16sdtfl="http://schemas.microsoft.com/office/word/2024/wordml/sdtformatlock" xmlns:w16se="http://schemas.microsoft.com/office/word/2015/wordml/symex" xmlns:wpg="http://schemas.microsoft.com/office/word/2010/wordprocessingGroup" xmlns:wpi="http://schemas.microsoft.com/office/word/2010/wordprocessingInk" xmlns:wne="http://schemas.microsoft.com/office/word/2006/wordml" xmlns:wps="http://schemas.microsoft.com/office/word/2010/wordprocessingShape" mc:Ignorable="w14 w15 w16se w16cid w16 w16cex w16sdtdh w16sdtfl w16du wp14">
   <w:abstractNum w:abstractNumId="0" w15:restartNumberingAfterBreak="0">
+    <w:nsid w:val="04335123"/>
+    <w:multiLevelType w:val="multilevel"/>
+    <w:tmpl w:val="05FCE166"/>
+    <w:lvl w:ilvl="0">
+      <w:start w:val="1"/>
+      <w:numFmt w:val="bullet"/>
+      <w:lvlText w:val=""/>
+      <w:lvlJc w:val="left"/>
+      <w:pPr>
+        <w:tabs>
+          <w:tab w:val="num" w:pos="720"/>
+        </w:tabs>
+        <w:ind w:left="720" w:hanging="360"/>
+      </w:pPr>
+      <w:rPr>
+        <w:rFonts w:ascii="Symbol" w:hAnsi="Symbol" w:hint="default"/>
+        <w:sz w:val="20"/>
+      </w:rPr>
+    </w:lvl>
+    <w:lvl w:ilvl="1" w:tentative="1">
+      <w:start w:val="1"/>
+      <w:numFmt w:val="bullet"/>
+      <w:lvlText w:val="o"/>
+      <w:lvlJc w:val="left"/>
+      <w:pPr>
+        <w:tabs>
+          <w:tab w:val="num" w:pos="1440"/>
+        </w:tabs>
+        <w:ind w:left="1440" w:hanging="360"/>
+      </w:pPr>
+      <w:rPr>
+        <w:rFonts w:ascii="Courier New" w:hAnsi="Courier New" w:hint="default"/>
+        <w:sz w:val="20"/>
+      </w:rPr>
+    </w:lvl>
+    <w:lvl w:ilvl="2" w:tentative="1">
+      <w:start w:val="1"/>
+      <w:numFmt w:val="bullet"/>
+      <w:lvlText w:val=""/>
+      <w:lvlJc w:val="left"/>
+      <w:pPr>
+        <w:tabs>
+          <w:tab w:val="num" w:pos="2160"/>
+        </w:tabs>
+        <w:ind w:left="2160" w:hanging="360"/>
+      </w:pPr>
+      <w:rPr>
+        <w:rFonts w:ascii="Wingdings" w:hAnsi="Wingdings" w:hint="default"/>
+        <w:sz w:val="20"/>
+      </w:rPr>
+    </w:lvl>
+    <w:lvl w:ilvl="3" w:tentative="1">
+      <w:start w:val="1"/>
+      <w:numFmt w:val="bullet"/>
+      <w:lvlText w:val=""/>
+      <w:lvlJc w:val="left"/>
+      <w:pPr>
+        <w:tabs>
+          <w:tab w:val="num" w:pos="2880"/>
+        </w:tabs>
+        <w:ind w:left="2880" w:hanging="360"/>
+      </w:pPr>
+      <w:rPr>
+        <w:rFonts w:ascii="Wingdings" w:hAnsi="Wingdings" w:hint="default"/>
+        <w:sz w:val="20"/>
+      </w:rPr>
+    </w:lvl>
+    <w:lvl w:ilvl="4" w:tentative="1">
+      <w:start w:val="1"/>
+      <w:numFmt w:val="bullet"/>
+      <w:lvlText w:val=""/>
+      <w:lvlJc w:val="left"/>
+      <w:pPr>
+        <w:tabs>
+          <w:tab w:val="num" w:pos="3600"/>
+        </w:tabs>
+        <w:ind w:left="3600" w:hanging="360"/>
+      </w:pPr>
+      <w:rPr>
+        <w:rFonts w:ascii="Wingdings" w:hAnsi="Wingdings" w:hint="default"/>
+        <w:sz w:val="20"/>
+      </w:rPr>
+    </w:lvl>
+    <w:lvl w:ilvl="5" w:tentative="1">
+      <w:start w:val="1"/>
+      <w:numFmt w:val="bullet"/>
+      <w:lvlText w:val=""/>
+      <w:lvlJc w:val="left"/>
+      <w:pPr>
+        <w:tabs>
+          <w:tab w:val="num" w:pos="4320"/>
+        </w:tabs>
+        <w:ind w:left="4320" w:hanging="360"/>
+      </w:pPr>
+      <w:rPr>
+        <w:rFonts w:ascii="Wingdings" w:hAnsi="Wingdings" w:hint="default"/>
+        <w:sz w:val="20"/>
+      </w:rPr>
+    </w:lvl>
+    <w:lvl w:ilvl="6" w:tentative="1">
+      <w:start w:val="1"/>
+      <w:numFmt w:val="bullet"/>
+      <w:lvlText w:val=""/>
+      <w:lvlJc w:val="left"/>
+      <w:pPr>
+        <w:tabs>
+          <w:tab w:val="num" w:pos="5040"/>
+        </w:tabs>
+        <w:ind w:left="5040" w:hanging="360"/>
+      </w:pPr>
+      <w:rPr>
+        <w:rFonts w:ascii="Wingdings" w:hAnsi="Wingdings" w:hint="default"/>
+        <w:sz w:val="20"/>
+      </w:rPr>
+    </w:lvl>
+    <w:lvl w:ilvl="7" w:tentative="1">
+      <w:start w:val="1"/>
+      <w:numFmt w:val="bullet"/>
+      <w:lvlText w:val=""/>
+      <w:lvlJc w:val="left"/>
+      <w:pPr>
+        <w:tabs>
+          <w:tab w:val="num" w:pos="5760"/>
+        </w:tabs>
+        <w:ind w:left="5760" w:hanging="360"/>
+      </w:pPr>
+      <w:rPr>
+        <w:rFonts w:ascii="Wingdings" w:hAnsi="Wingdings" w:hint="default"/>
+        <w:sz w:val="20"/>
+      </w:rPr>
+    </w:lvl>
+    <w:lvl w:ilvl="8" w:tentative="1">
+      <w:start w:val="1"/>
+      <w:numFmt w:val="bullet"/>
+      <w:lvlText w:val=""/>
+      <w:lvlJc w:val="left"/>
+      <w:pPr>
+        <w:tabs>
+          <w:tab w:val="num" w:pos="6480"/>
+        </w:tabs>
+        <w:ind w:left="6480" w:hanging="360"/>
+      </w:pPr>
+      <w:rPr>
+        <w:rFonts w:ascii="Wingdings" w:hAnsi="Wingdings" w:hint="default"/>
+        <w:sz w:val="20"/>
+      </w:rPr>
+    </w:lvl>
+  </w:abstractNum>
+  <w:abstractNum w:abstractNumId="1" w15:restartNumberingAfterBreak="0">
+    <w:nsid w:val="203300E6"/>
+    <w:multiLevelType w:val="multilevel"/>
+    <w:tmpl w:val="6BEA6BB6"/>
+    <w:lvl w:ilvl="0">
+      <w:start w:val="1"/>
+      <w:numFmt w:val="bullet"/>
+      <w:lvlText w:val=""/>
+      <w:lvlJc w:val="left"/>
+      <w:pPr>
+        <w:tabs>
+          <w:tab w:val="num" w:pos="720"/>
+        </w:tabs>
+        <w:ind w:left="720" w:hanging="360"/>
+      </w:pPr>
+      <w:rPr>
+        <w:rFonts w:ascii="Symbol" w:hAnsi="Symbol" w:hint="default"/>
+        <w:sz w:val="20"/>
+      </w:rPr>
+    </w:lvl>
+    <w:lvl w:ilvl="1" w:tentative="1">
+      <w:start w:val="1"/>
+      <w:numFmt w:val="bullet"/>
+      <w:lvlText w:val="o"/>
+      <w:lvlJc w:val="left"/>
+      <w:pPr>
+        <w:tabs>
+          <w:tab w:val="num" w:pos="1440"/>
+        </w:tabs>
+        <w:ind w:left="1440" w:hanging="360"/>
+      </w:pPr>
+      <w:rPr>
+        <w:rFonts w:ascii="Courier New" w:hAnsi="Courier New" w:hint="default"/>
+        <w:sz w:val="20"/>
+      </w:rPr>
+    </w:lvl>
+    <w:lvl w:ilvl="2" w:tentative="1">
+      <w:start w:val="1"/>
+      <w:numFmt w:val="bullet"/>
+      <w:lvlText w:val=""/>
+      <w:lvlJc w:val="left"/>
+      <w:pPr>
+        <w:tabs>
+          <w:tab w:val="num" w:pos="2160"/>
+        </w:tabs>
+        <w:ind w:left="2160" w:hanging="360"/>
+      </w:pPr>
+      <w:rPr>
+        <w:rFonts w:ascii="Wingdings" w:hAnsi="Wingdings" w:hint="default"/>
+        <w:sz w:val="20"/>
+      </w:rPr>
+    </w:lvl>
+    <w:lvl w:ilvl="3" w:tentative="1">
+      <w:start w:val="1"/>
+      <w:numFmt w:val="bullet"/>
+      <w:lvlText w:val=""/>
+      <w:lvlJc w:val="left"/>
+      <w:pPr>
+        <w:tabs>
+          <w:tab w:val="num" w:pos="2880"/>
+        </w:tabs>
+        <w:ind w:left="2880" w:hanging="360"/>
+      </w:pPr>
+      <w:rPr>
+        <w:rFonts w:ascii="Wingdings" w:hAnsi="Wingdings" w:hint="default"/>
+        <w:sz w:val="20"/>
+      </w:rPr>
+    </w:lvl>
+    <w:lvl w:ilvl="4" w:tentative="1">
+      <w:start w:val="1"/>
+      <w:numFmt w:val="bullet"/>
+      <w:lvlText w:val=""/>
+      <w:lvlJc w:val="left"/>
+      <w:pPr>
+        <w:tabs>
+          <w:tab w:val="num" w:pos="3600"/>
+        </w:tabs>
+        <w:ind w:left="3600" w:hanging="360"/>
+      </w:pPr>
+      <w:rPr>
+        <w:rFonts w:ascii="Wingdings" w:hAnsi="Wingdings" w:hint="default"/>
+        <w:sz w:val="20"/>
+      </w:rPr>
+    </w:lvl>
+    <w:lvl w:ilvl="5" w:tentative="1">
+      <w:start w:val="1"/>
+      <w:numFmt w:val="bullet"/>
+      <w:lvlText w:val=""/>
+      <w:lvlJc w:val="left"/>
+      <w:pPr>
+        <w:tabs>
+          <w:tab w:val="num" w:pos="4320"/>
+        </w:tabs>
+        <w:ind w:left="4320" w:hanging="360"/>
+      </w:pPr>
+      <w:rPr>
+        <w:rFonts w:ascii="Wingdings" w:hAnsi="Wingdings" w:hint="default"/>
+        <w:sz w:val="20"/>
+      </w:rPr>
+    </w:lvl>
+    <w:lvl w:ilvl="6" w:tentative="1">
+      <w:start w:val="1"/>
+      <w:numFmt w:val="bullet"/>
+      <w:lvlText w:val=""/>
+      <w:lvlJc w:val="left"/>
+      <w:pPr>
+        <w:tabs>
+          <w:tab w:val="num" w:pos="5040"/>
+        </w:tabs>
+        <w:ind w:left="5040" w:hanging="360"/>
+      </w:pPr>
+      <w:rPr>
+        <w:rFonts w:ascii="Wingdings" w:hAnsi="Wingdings" w:hint="default"/>
+        <w:sz w:val="20"/>
+      </w:rPr>
+    </w:lvl>
+    <w:lvl w:ilvl="7" w:tentative="1">
+      <w:start w:val="1"/>
+      <w:numFmt w:val="bullet"/>
+      <w:lvlText w:val=""/>
+      <w:lvlJc w:val="left"/>
+      <w:pPr>
+        <w:tabs>
+          <w:tab w:val="num" w:pos="5760"/>
+        </w:tabs>
+        <w:ind w:left="5760" w:hanging="360"/>
+      </w:pPr>
+      <w:rPr>
+        <w:rFonts w:ascii="Wingdings" w:hAnsi="Wingdings" w:hint="default"/>
+        <w:sz w:val="20"/>
+      </w:rPr>
+    </w:lvl>
+    <w:lvl w:ilvl="8" w:tentative="1">
+      <w:start w:val="1"/>
+      <w:numFmt w:val="bullet"/>
+      <w:lvlText w:val=""/>
+      <w:lvlJc w:val="left"/>
+      <w:pPr>
+        <w:tabs>
+          <w:tab w:val="num" w:pos="6480"/>
+        </w:tabs>
+        <w:ind w:left="6480" w:hanging="360"/>
+      </w:pPr>
+      <w:rPr>
+        <w:rFonts w:ascii="Wingdings" w:hAnsi="Wingdings" w:hint="default"/>
+        <w:sz w:val="20"/>
+      </w:rPr>
+    </w:lvl>
+  </w:abstractNum>
+  <w:abstractNum w:abstractNumId="2" w15:restartNumberingAfterBreak="0">
     <w:nsid w:val="662A131E"/>
     <w:multiLevelType w:val="hybridMultilevel"/>
     <w:tmpl w:val="342CDFB8"/>
@@ -1355,7 +2213,13 @@
     </w:lvl>
   </w:abstractNum>
   <w:num w:numId="1" w16cid:durableId="1729450730">
+    <w:abstractNumId w:val="2"/>
+  </w:num>
+  <w:num w:numId="2" w16cid:durableId="1360663209">
     <w:abstractNumId w:val="0"/>
+  </w:num>
+  <w:num w:numId="3" w16cid:durableId="1112362345">
+    <w:abstractNumId w:val="1"/>
   </w:num>
 </w:numbering>
 </file>
@@ -1755,7 +2619,7 @@
     <w:name w:val="Normal"/>
     <w:qFormat/>
   </w:style>
-  <w:style w:type="paragraph" w:styleId="Rubrik1">
+  <w:style w:type="paragraph" w:styleId="Heading1">
     <w:name w:val="heading 1"/>
     <w:basedOn w:val="Normal"/>
     <w:next w:val="Normal"/>
@@ -1774,7 +2638,7 @@
       <w:szCs w:val="32"/>
     </w:rPr>
   </w:style>
-  <w:style w:type="paragraph" w:styleId="Rubrik2">
+  <w:style w:type="paragraph" w:styleId="Heading2">
     <w:name w:val="heading 2"/>
     <w:basedOn w:val="Normal"/>
     <w:next w:val="Normal"/>
@@ -1794,11 +2658,11 @@
       <w:szCs w:val="36"/>
     </w:rPr>
   </w:style>
-  <w:style w:type="paragraph" w:styleId="Rubrik3">
+  <w:style w:type="paragraph" w:styleId="Heading3">
     <w:name w:val="heading 3"/>
     <w:basedOn w:val="Normal"/>
     <w:next w:val="Normal"/>
-    <w:link w:val="Rubrik3Char"/>
+    <w:link w:val="Heading3Char"/>
     <w:uiPriority w:val="9"/>
     <w:unhideWhenUsed/>
     <w:qFormat/>
@@ -1815,7 +2679,7 @@
       <w:szCs w:val="26"/>
     </w:rPr>
   </w:style>
-  <w:style w:type="paragraph" w:styleId="Rubrik4">
+  <w:style w:type="paragraph" w:styleId="Heading4">
     <w:name w:val="heading 4"/>
     <w:basedOn w:val="Normal"/>
     <w:next w:val="Normal"/>
@@ -1834,7 +2698,7 @@
       <w:bCs/>
     </w:rPr>
   </w:style>
-  <w:style w:type="paragraph" w:styleId="Rubrik5">
+  <w:style w:type="paragraph" w:styleId="Heading5">
     <w:name w:val="heading 5"/>
     <w:basedOn w:val="Normal"/>
     <w:next w:val="Normal"/>
@@ -1855,7 +2719,7 @@
       <w:szCs w:val="22"/>
     </w:rPr>
   </w:style>
-  <w:style w:type="paragraph" w:styleId="Rubrik6">
+  <w:style w:type="paragraph" w:styleId="Heading6">
     <w:name w:val="heading 6"/>
     <w:basedOn w:val="Normal"/>
     <w:next w:val="Normal"/>
@@ -1876,13 +2740,13 @@
       <w:szCs w:val="20"/>
     </w:rPr>
   </w:style>
-  <w:style w:type="character" w:default="1" w:styleId="Standardstycketeckensnitt">
+  <w:style w:type="character" w:default="1" w:styleId="DefaultParagraphFont">
     <w:name w:val="Default Paragraph Font"/>
     <w:uiPriority w:val="1"/>
     <w:semiHidden/>
     <w:unhideWhenUsed/>
   </w:style>
-  <w:style w:type="table" w:default="1" w:styleId="Normaltabell">
+  <w:style w:type="table" w:default="1" w:styleId="TableNormal">
     <w:name w:val="Normal Table"/>
     <w:uiPriority w:val="99"/>
     <w:semiHidden/>
@@ -1897,13 +2761,13 @@
       </w:tblCellMar>
     </w:tblPr>
   </w:style>
-  <w:style w:type="numbering" w:default="1" w:styleId="Ingenlista">
+  <w:style w:type="numbering" w:default="1" w:styleId="NoList">
     <w:name w:val="No List"/>
     <w:uiPriority w:val="99"/>
     <w:semiHidden/>
     <w:unhideWhenUsed/>
   </w:style>
-  <w:style w:type="table" w:customStyle="1" w:styleId="TableNormal">
+  <w:style w:type="table" w:customStyle="1" w:styleId="TableNormal0">
     <w:name w:val="TableNormal"/>
     <w:tblPr>
       <w:tblCellMar>
@@ -1914,7 +2778,7 @@
       </w:tblCellMar>
     </w:tblPr>
   </w:style>
-  <w:style w:type="paragraph" w:styleId="Rubrik">
+  <w:style w:type="paragraph" w:styleId="Title">
     <w:name w:val="Title"/>
     <w:basedOn w:val="Normal"/>
     <w:next w:val="Normal"/>
@@ -1947,7 +2811,7 @@
       <w:lang w:val="en-US" w:eastAsia="en-US"/>
     </w:rPr>
   </w:style>
-  <w:style w:type="paragraph" w:styleId="Sidfot">
+  <w:style w:type="paragraph" w:styleId="Footer">
     <w:name w:val="footer"/>
     <w:basedOn w:val="Normal"/>
     <w:rsid w:val="003F3001"/>
@@ -1965,9 +2829,9 @@
       <w:lang w:val="en-US" w:eastAsia="en-US"/>
     </w:rPr>
   </w:style>
-  <w:style w:type="character" w:customStyle="1" w:styleId="Rubrik3Char">
-    <w:name w:val="Rubrik 3 Char"/>
-    <w:link w:val="Rubrik3"/>
+  <w:style w:type="character" w:customStyle="1" w:styleId="Heading3Char">
+    <w:name w:val="Heading 3 Char"/>
+    <w:link w:val="Heading3"/>
     <w:rsid w:val="003F3001"/>
     <w:rPr>
       <w:rFonts w:ascii="Arial" w:hAnsi="Arial" w:cs="Arial"/>
@@ -1978,7 +2842,7 @@
       <w:lang w:val="sv-SE" w:eastAsia="sv-SE" w:bidi="ar-SA"/>
     </w:rPr>
   </w:style>
-  <w:style w:type="paragraph" w:styleId="Brdtext">
+  <w:style w:type="paragraph" w:styleId="BodyText">
     <w:name w:val="Body Text"/>
     <w:basedOn w:val="Normal"/>
     <w:rsid w:val="00116362"/>
@@ -1994,7 +2858,7 @@
       <w:lang w:val="en-US" w:eastAsia="en-US"/>
     </w:rPr>
   </w:style>
-  <w:style w:type="paragraph" w:styleId="Underrubrik">
+  <w:style w:type="paragraph" w:styleId="Subtitle">
     <w:name w:val="Subtitle"/>
     <w:basedOn w:val="Normal"/>
     <w:next w:val="Normal"/>
@@ -2015,7 +2879,7 @@
     </w:rPr>
   </w:style>
   <w:style w:type="table" w:customStyle="1" w:styleId="a">
-    <w:basedOn w:val="Normaltabell"/>
+    <w:basedOn w:val="TableNormal"/>
     <w:tblPr>
       <w:tblStyleRowBandSize w:val="1"/>
       <w:tblStyleColBandSize w:val="1"/>
@@ -2026,7 +2890,7 @@
     </w:tblPr>
   </w:style>
   <w:style w:type="table" w:customStyle="1" w:styleId="a0">
-    <w:basedOn w:val="Normaltabell"/>
+    <w:basedOn w:val="TableNormal"/>
     <w:tblPr>
       <w:tblStyleRowBandSize w:val="1"/>
       <w:tblStyleColBandSize w:val="1"/>
@@ -2036,7 +2900,7 @@
       </w:tblCellMar>
     </w:tblPr>
   </w:style>
-  <w:style w:type="paragraph" w:styleId="Liststycke">
+  <w:style w:type="paragraph" w:styleId="ListParagraph">
     <w:name w:val="List Paragraph"/>
     <w:basedOn w:val="Normal"/>
     <w:uiPriority w:val="34"/>

</xml_diff>